<commit_message>
release: v1.1.0 (ConditionalBlock, conditional config, Symfony 7/8 only)
Add Twig-style ${#if}…${#endif} regions via ConditionalBlock with nested
inside-out resolution, four conditional_* config keys, and listVariables
filtering. Drop Symfony 6.4 support; demo is symfony8-only with full feature
coverage. Tests and docs updated; line coverage ≥99%.
</commit_message>
<xml_diff>
--- a/demo/symfony8/public/demo/doc-final-tpl.docx
+++ b/demo/symfony8/public/demo/doc-final-tpl.docx
@@ -130,6 +130,16 @@
     </w:p>
     <w:p>
       <w:pPr>
+        <w:jc w:val="both"/>
+        <w:spacing w:after="240"/>
+      </w:pPr>
+      <w:r>
+        <w:rPr/>
+        <w:t xml:space="preserve">Client tier (inline scalar): ${client_tier_label}</w:t>
+      </w:r>
+    </w:p>
+    <w:p>
+      <w:pPr>
         <w:pStyle w:val="Heading1"/>
       </w:pPr>
       <w:bookmarkStart w:id="1" w:name="_Toc2"/>
@@ -297,6 +307,16 @@
           <w:iCs w:val="1"/>
         </w:rPr>
         <w:t xml:space="preserve">Source: ${figure1.source}</w:t>
+      </w:r>
+    </w:p>
+    <w:p>
+      <w:pPr>
+        <w:jc w:val="both"/>
+        <w:spacing w:after="240"/>
+      </w:pPr>
+      <w:r>
+        <w:rPr/>
+        <w:t xml:space="preserve">${demo_logo}</w:t>
       </w:r>
     </w:p>
     <w:p>
@@ -505,6 +525,56 @@
       <w:r>
         <w:rPr/>
         <w:t xml:space="preserve">${acknowledgements.body}</w:t>
+      </w:r>
+    </w:p>
+    <w:p>
+      <w:pPr>
+        <w:jc w:val="both"/>
+        <w:spacing w:after="240"/>
+      </w:pPr>
+      <w:r>
+        <w:rPr/>
+        <w:t xml:space="preserve">${#if optional_funding}</w:t>
+      </w:r>
+    </w:p>
+    <w:p>
+      <w:pPr>
+        <w:jc w:val="both"/>
+        <w:spacing w:after="240"/>
+      </w:pPr>
+      <w:r>
+        <w:rPr/>
+        <w:t xml:space="preserve">${#if funding_detail}</w:t>
+      </w:r>
+    </w:p>
+    <w:p>
+      <w:pPr>
+        <w:jc w:val="both"/>
+        <w:spacing w:after="240"/>
+      </w:pPr>
+      <w:r>
+        <w:rPr/>
+        <w:t xml:space="preserve">${optional_funding.note}</w:t>
+      </w:r>
+    </w:p>
+    <w:p>
+      <w:pPr>
+        <w:jc w:val="both"/>
+        <w:spacing w:after="240"/>
+      </w:pPr>
+      <w:r>
+        <w:rPr/>
+        <w:t xml:space="preserve">${#endif funding_detail}</w:t>
+      </w:r>
+    </w:p>
+    <w:p>
+      <w:pPr>
+        <w:jc w:val="both"/>
+        <w:spacing w:after="240"/>
+      </w:pPr>
+      <w:r>
+        <w:rPr/>
+        <w:t xml:space="preserve">${#endif optional_funding}</w:t>
       </w:r>
     </w:p>
     <w:p>

</xml_diff>